<commit_message>
refactor: consolidate automation scripts by adding print_outstanding.ps1 and removing legacy utility scripts
</commit_message>
<xml_diff>
--- a/02_WHY YOU THINK YOUR NOMINEE SHOULD BE SELECTED.docx
+++ b/02_WHY YOU THINK YOUR NOMINEE SHOULD BE SELECTED.docx
@@ -16,63 +16,113 @@
           <w:b/>
           <w:sz w:val="32"/>
         </w:rPr>
-        <w:t>Justification for the Nomination of Vimlesh Kumar for the ABU Broadcast Engineering Excellence Award</w:t>
-      </w:r>
-    </w:p>
-    <w:p>
-      <w:pPr>
+        <w:t xml:space="preserve">Justification for the Nomination of </w:t>
+      </w:r>
+      <w:proofErr w:type="spellStart"/>
+      <w:r>
         <w:rPr>
           <w:rFonts w:ascii="Calibri" w:hAnsi="Calibri" w:cs="Calibri"/>
           <w:b/>
           <w:sz w:val="32"/>
         </w:rPr>
-      </w:pPr>
-    </w:p>
-    <w:p>
-      <w:pPr>
-        <w:rPr>
-          <w:rFonts w:ascii="Calibri" w:hAnsi="Calibri" w:cs="Calibri"/>
-          <w:sz w:val="24"/>
-        </w:rPr>
-      </w:pPr>
-      <w:r>
-        <w:rPr>
-          <w:rFonts w:ascii="Calibri" w:hAnsi="Calibri" w:cs="Calibri"/>
-          <w:sz w:val="24"/>
-        </w:rPr>
-        <w:t>Vimlesh Kumar is an exceptionally talented and dedicated broadcast engineer and software developer whose contributions have profoundly impacted the broadcasting industry, both within his organization and across the global broadcast community.</w:t>
-      </w:r>
-    </w:p>
-    <w:p>
-      <w:pPr>
-        <w:rPr>
-          <w:rFonts w:ascii="Calibri" w:hAnsi="Calibri" w:cs="Calibri"/>
-          <w:sz w:val="24"/>
-        </w:rPr>
-      </w:pPr>
-    </w:p>
-    <w:p>
-      <w:pPr>
-        <w:rPr>
-          <w:rFonts w:ascii="Calibri" w:hAnsi="Calibri" w:cs="Calibri"/>
-          <w:sz w:val="24"/>
-        </w:rPr>
-      </w:pPr>
-      <w:r>
-        <w:rPr>
-          <w:rFonts w:ascii="Calibri" w:hAnsi="Calibri" w:cs="Calibri"/>
-          <w:sz w:val="24"/>
-        </w:rPr>
-        <w:t>His innovative approach to integrating affordable, off-the-shelf hardware (such as Blackmagic DeckLink) with robust open-source software (like CasparCG) has revolutionized cost-effective broadcasting. By developing a comprehensive suite of highly specialized tools, Vimlesh has provided broadcasters with professional-grade capabilities without the exorbitant costs typically associated with proprietary broadcast equipment.</w:t>
-      </w:r>
-    </w:p>
-    <w:p>
-      <w:pPr>
-        <w:rPr>
-          <w:rFonts w:ascii="Calibri" w:hAnsi="Calibri" w:cs="Calibri"/>
-          <w:sz w:val="24"/>
-        </w:rPr>
-      </w:pPr>
+        <w:t>Vimlesh</w:t>
+      </w:r>
+      <w:proofErr w:type="spellEnd"/>
+      <w:r>
+        <w:rPr>
+          <w:rFonts w:ascii="Calibri" w:hAnsi="Calibri" w:cs="Calibri"/>
+          <w:b/>
+          <w:sz w:val="32"/>
+        </w:rPr>
+        <w:t xml:space="preserve"> Kumar for the ABU Broadcast Engineering Excellence Award</w:t>
+      </w:r>
+    </w:p>
+    <w:p>
+      <w:pPr>
+        <w:rPr>
+          <w:rFonts w:ascii="Calibri" w:hAnsi="Calibri" w:cs="Calibri"/>
+          <w:sz w:val="24"/>
+        </w:rPr>
+      </w:pPr>
+      <w:proofErr w:type="spellStart"/>
+      <w:r>
+        <w:rPr>
+          <w:rFonts w:ascii="Calibri" w:hAnsi="Calibri" w:cs="Calibri"/>
+          <w:sz w:val="24"/>
+        </w:rPr>
+        <w:t>Vimlesh</w:t>
+      </w:r>
+      <w:proofErr w:type="spellEnd"/>
+      <w:r>
+        <w:rPr>
+          <w:rFonts w:ascii="Calibri" w:hAnsi="Calibri" w:cs="Calibri"/>
+          <w:sz w:val="24"/>
+        </w:rPr>
+        <w:t xml:space="preserve"> Kumar is an exceptionally talented and dedicated broadcast engineer and software developer whose contributions have profoundly impacted the broadcasting industry, both within his organization and across the global broadcast community.</w:t>
+      </w:r>
+    </w:p>
+    <w:p>
+      <w:pPr>
+        <w:rPr>
+          <w:rFonts w:ascii="Calibri" w:hAnsi="Calibri" w:cs="Calibri"/>
+          <w:sz w:val="24"/>
+        </w:rPr>
+      </w:pPr>
+      <w:r>
+        <w:rPr>
+          <w:rFonts w:ascii="Calibri" w:hAnsi="Calibri" w:cs="Calibri"/>
+          <w:sz w:val="24"/>
+        </w:rPr>
+        <w:t xml:space="preserve">His innovative approach to integrating affordable, off-the-shelf hardware (such as </w:t>
+      </w:r>
+      <w:proofErr w:type="spellStart"/>
+      <w:r>
+        <w:rPr>
+          <w:rFonts w:ascii="Calibri" w:hAnsi="Calibri" w:cs="Calibri"/>
+          <w:sz w:val="24"/>
+        </w:rPr>
+        <w:t>Blackmagic</w:t>
+      </w:r>
+      <w:proofErr w:type="spellEnd"/>
+      <w:r>
+        <w:rPr>
+          <w:rFonts w:ascii="Calibri" w:hAnsi="Calibri" w:cs="Calibri"/>
+          <w:sz w:val="24"/>
+        </w:rPr>
+        <w:t xml:space="preserve"> DeckLink) with robust open-source software (like </w:t>
+      </w:r>
+      <w:proofErr w:type="spellStart"/>
+      <w:r>
+        <w:rPr>
+          <w:rFonts w:ascii="Calibri" w:hAnsi="Calibri" w:cs="Calibri"/>
+          <w:sz w:val="24"/>
+        </w:rPr>
+        <w:t>CasparCG</w:t>
+      </w:r>
+      <w:proofErr w:type="spellEnd"/>
+      <w:r>
+        <w:rPr>
+          <w:rFonts w:ascii="Calibri" w:hAnsi="Calibri" w:cs="Calibri"/>
+          <w:sz w:val="24"/>
+        </w:rPr>
+        <w:t xml:space="preserve">) has revolutionized cost-effective broadcasting. By developing a comprehensive suite of highly specialized tools, </w:t>
+      </w:r>
+      <w:proofErr w:type="spellStart"/>
+      <w:r>
+        <w:rPr>
+          <w:rFonts w:ascii="Calibri" w:hAnsi="Calibri" w:cs="Calibri"/>
+          <w:sz w:val="24"/>
+        </w:rPr>
+        <w:t>Vimlesh</w:t>
+      </w:r>
+      <w:proofErr w:type="spellEnd"/>
+      <w:r>
+        <w:rPr>
+          <w:rFonts w:ascii="Calibri" w:hAnsi="Calibri" w:cs="Calibri"/>
+          <w:sz w:val="24"/>
+        </w:rPr>
+        <w:t xml:space="preserve"> has provided broadcasters with professional-grade capabilities without the exorbitant costs typically associated with proprietary broadcast equipment.</w:t>
+      </w:r>
     </w:p>
     <w:p>
       <w:pPr>
@@ -96,37 +146,73 @@
           <w:sz w:val="24"/>
         </w:rPr>
       </w:pPr>
-    </w:p>
-    <w:p>
-      <w:pPr>
-        <w:rPr>
-          <w:rFonts w:ascii="Calibri" w:hAnsi="Calibri" w:cs="Calibri"/>
-          <w:sz w:val="24"/>
-        </w:rPr>
-      </w:pPr>
-      <w:r>
-        <w:rPr>
-          <w:rFonts w:ascii="Calibri" w:hAnsi="Calibri" w:cs="Calibri"/>
-          <w:b/>
-          <w:sz w:val="24"/>
-        </w:rPr>
-        <w:t xml:space="preserve">1. Development of the ReactCasparClient and WebAnimator: </w:t>
-      </w:r>
-      <w:r>
-        <w:rPr>
-          <w:rFonts w:ascii="Calibri" w:hAnsi="Calibri" w:cs="Calibri"/>
-          <w:sz w:val="24"/>
-        </w:rPr>
-        <w:t>He single-handedly developed modern, web-based control clients and animation tools for the widely used CasparCG platform. This enables broadcasters to easily design, schedule, and trigger complex on-air graphics, channel rolls, and lower thirds directly from a web browser.</w:t>
-      </w:r>
-    </w:p>
-    <w:p>
-      <w:pPr>
-        <w:rPr>
-          <w:rFonts w:ascii="Calibri" w:hAnsi="Calibri" w:cs="Calibri"/>
-          <w:sz w:val="24"/>
-        </w:rPr>
-      </w:pPr>
+      <w:r>
+        <w:rPr>
+          <w:rFonts w:ascii="Calibri" w:hAnsi="Calibri" w:cs="Calibri"/>
+          <w:b/>
+          <w:sz w:val="24"/>
+        </w:rPr>
+        <w:t xml:space="preserve">1. Development of the </w:t>
+      </w:r>
+      <w:proofErr w:type="spellStart"/>
+      <w:r>
+        <w:rPr>
+          <w:rFonts w:ascii="Calibri" w:hAnsi="Calibri" w:cs="Calibri"/>
+          <w:b/>
+          <w:sz w:val="24"/>
+        </w:rPr>
+        <w:t>ReactCasparClient</w:t>
+      </w:r>
+      <w:proofErr w:type="spellEnd"/>
+      <w:r>
+        <w:rPr>
+          <w:rFonts w:ascii="Calibri" w:hAnsi="Calibri" w:cs="Calibri"/>
+          <w:b/>
+          <w:sz w:val="24"/>
+        </w:rPr>
+        <w:t xml:space="preserve"> and </w:t>
+      </w:r>
+      <w:proofErr w:type="spellStart"/>
+      <w:r>
+        <w:rPr>
+          <w:rFonts w:ascii="Calibri" w:hAnsi="Calibri" w:cs="Calibri"/>
+          <w:b/>
+          <w:sz w:val="24"/>
+        </w:rPr>
+        <w:t>WebAnimator</w:t>
+      </w:r>
+      <w:proofErr w:type="spellEnd"/>
+      <w:r>
+        <w:rPr>
+          <w:rFonts w:ascii="Calibri" w:hAnsi="Calibri" w:cs="Calibri"/>
+          <w:b/>
+          <w:sz w:val="24"/>
+        </w:rPr>
+        <w:t xml:space="preserve">: </w:t>
+      </w:r>
+      <w:r>
+        <w:rPr>
+          <w:rFonts w:ascii="Calibri" w:hAnsi="Calibri" w:cs="Calibri"/>
+          <w:sz w:val="24"/>
+        </w:rPr>
+        <w:t xml:space="preserve">He single-handedly developed modern, web-based control clients and animation tools for the widely used </w:t>
+      </w:r>
+      <w:proofErr w:type="spellStart"/>
+      <w:r>
+        <w:rPr>
+          <w:rFonts w:ascii="Calibri" w:hAnsi="Calibri" w:cs="Calibri"/>
+          <w:sz w:val="24"/>
+        </w:rPr>
+        <w:t>CasparCG</w:t>
+      </w:r>
+      <w:proofErr w:type="spellEnd"/>
+      <w:r>
+        <w:rPr>
+          <w:rFonts w:ascii="Calibri" w:hAnsi="Calibri" w:cs="Calibri"/>
+          <w:sz w:val="24"/>
+        </w:rPr>
+        <w:t xml:space="preserve"> platform. This enables broadcasters to easily design, schedule, and trigger complex on-air graphics, channel rolls, and lower thirds directly from a web browser.</w:t>
+      </w:r>
     </w:p>
     <w:p>
       <w:pPr>
@@ -148,16 +234,40 @@
           <w:rFonts w:ascii="Calibri" w:hAnsi="Calibri" w:cs="Calibri"/>
           <w:sz w:val="24"/>
         </w:rPr>
-        <w:t>His applications seamlessly integrate with Blackmagic DeckLink hardware to provide advanced capabilities such as multi-channel video and audio recording, slow-motion playback, HTML-to-DeckLink rendering, and off-air logging. His tools are robust enough to serve as primary channel playout video servers in live environments.</w:t>
-      </w:r>
-    </w:p>
-    <w:p>
-      <w:pPr>
-        <w:rPr>
-          <w:rFonts w:ascii="Calibri" w:hAnsi="Calibri" w:cs="Calibri"/>
-          <w:sz w:val="24"/>
-        </w:rPr>
-      </w:pPr>
+        <w:t xml:space="preserve">His applications seamlessly integrate with </w:t>
+      </w:r>
+      <w:proofErr w:type="spellStart"/>
+      <w:r>
+        <w:rPr>
+          <w:rFonts w:ascii="Calibri" w:hAnsi="Calibri" w:cs="Calibri"/>
+          <w:sz w:val="24"/>
+        </w:rPr>
+        <w:t>Blackmagic</w:t>
+      </w:r>
+      <w:proofErr w:type="spellEnd"/>
+      <w:r>
+        <w:rPr>
+          <w:rFonts w:ascii="Calibri" w:hAnsi="Calibri" w:cs="Calibri"/>
+          <w:sz w:val="24"/>
+        </w:rPr>
+        <w:t xml:space="preserve"> DeckLink hardware to provide advanced capabilities such as multi-channel video and audio recording, slow-motion playback, HTML-to-DeckLink rendering, and off-air logging. His tools are robust enough to serve as primary channel </w:t>
+      </w:r>
+      <w:proofErr w:type="spellStart"/>
+      <w:r>
+        <w:rPr>
+          <w:rFonts w:ascii="Calibri" w:hAnsi="Calibri" w:cs="Calibri"/>
+          <w:sz w:val="24"/>
+        </w:rPr>
+        <w:t>playout</w:t>
+      </w:r>
+      <w:proofErr w:type="spellEnd"/>
+      <w:r>
+        <w:rPr>
+          <w:rFonts w:ascii="Calibri" w:hAnsi="Calibri" w:cs="Calibri"/>
+          <w:sz w:val="24"/>
+        </w:rPr>
+        <w:t xml:space="preserve"> video servers in live environments.</w:t>
+      </w:r>
     </w:p>
     <w:p>
       <w:pPr>
@@ -174,21 +284,38 @@
         </w:rPr>
         <w:t xml:space="preserve">3. Versatile Software Solutions for Live Production: </w:t>
       </w:r>
-      <w:r>
-        <w:rPr>
-          <w:rFonts w:ascii="Calibri" w:hAnsi="Calibri" w:cs="Calibri"/>
-          <w:sz w:val="24"/>
-        </w:rPr>
-        <w:t>Vimlesh has created numerous crucial applications tailored for live broadcast environments, including Web Teleprompters with multi-lingual support, WebSocket inspectors for newsroom systems, Streaming Studio Dashboards, and Election Control Panels capable of handling massive amounts of real-time data.</w:t>
-      </w:r>
-    </w:p>
-    <w:p>
-      <w:pPr>
-        <w:rPr>
-          <w:rFonts w:ascii="Calibri" w:hAnsi="Calibri" w:cs="Calibri"/>
-          <w:sz w:val="24"/>
-        </w:rPr>
-      </w:pPr>
+      <w:proofErr w:type="spellStart"/>
+      <w:r>
+        <w:rPr>
+          <w:rFonts w:ascii="Calibri" w:hAnsi="Calibri" w:cs="Calibri"/>
+          <w:sz w:val="24"/>
+        </w:rPr>
+        <w:t>Vimlesh</w:t>
+      </w:r>
+      <w:proofErr w:type="spellEnd"/>
+      <w:r>
+        <w:rPr>
+          <w:rFonts w:ascii="Calibri" w:hAnsi="Calibri" w:cs="Calibri"/>
+          <w:sz w:val="24"/>
+        </w:rPr>
+        <w:t xml:space="preserve"> has created numerous crucial applications tailored for live broadcast environments, including Web Teleprompters with multi-lingual support, </w:t>
+      </w:r>
+      <w:proofErr w:type="spellStart"/>
+      <w:r>
+        <w:rPr>
+          <w:rFonts w:ascii="Calibri" w:hAnsi="Calibri" w:cs="Calibri"/>
+          <w:sz w:val="24"/>
+        </w:rPr>
+        <w:t>WebSocket</w:t>
+      </w:r>
+      <w:proofErr w:type="spellEnd"/>
+      <w:r>
+        <w:rPr>
+          <w:rFonts w:ascii="Calibri" w:hAnsi="Calibri" w:cs="Calibri"/>
+          <w:sz w:val="24"/>
+        </w:rPr>
+        <w:t xml:space="preserve"> inspectors for newsroom systems, Streaming Studio Dashboards, and Election Control Panels capable of handling massive amounts of real-time data.</w:t>
+      </w:r>
     </w:p>
     <w:p>
       <w:pPr>
@@ -210,7 +337,340 @@
           <w:rFonts w:ascii="Calibri" w:hAnsi="Calibri" w:cs="Calibri"/>
           <w:sz w:val="24"/>
         </w:rPr>
-        <w:t>Instead of keeping his solutions proprietary, Vimlesh has open-sourced an extensive repository of his work (GitHub: vimlesh1975). These applications are actively utilized not only by his parent organization but also by a massive global community of broadcast engineers and CasparCG users. His continuous support, updates, and community engagement demonstrate true leadership.</w:t>
+        <w:t xml:space="preserve">Instead of keeping his solutions proprietary, </w:t>
+      </w:r>
+      <w:proofErr w:type="spellStart"/>
+      <w:r>
+        <w:rPr>
+          <w:rFonts w:ascii="Calibri" w:hAnsi="Calibri" w:cs="Calibri"/>
+          <w:sz w:val="24"/>
+        </w:rPr>
+        <w:t>Vimlesh</w:t>
+      </w:r>
+      <w:proofErr w:type="spellEnd"/>
+      <w:r>
+        <w:rPr>
+          <w:rFonts w:ascii="Calibri" w:hAnsi="Calibri" w:cs="Calibri"/>
+          <w:sz w:val="24"/>
+        </w:rPr>
+        <w:t xml:space="preserve"> has open-sourced an extensive repository of his work (</w:t>
+      </w:r>
+      <w:proofErr w:type="spellStart"/>
+      <w:r>
+        <w:rPr>
+          <w:rFonts w:ascii="Calibri" w:hAnsi="Calibri" w:cs="Calibri"/>
+          <w:sz w:val="24"/>
+        </w:rPr>
+        <w:t>GitHub</w:t>
+      </w:r>
+      <w:proofErr w:type="spellEnd"/>
+      <w:r>
+        <w:rPr>
+          <w:rFonts w:ascii="Calibri" w:hAnsi="Calibri" w:cs="Calibri"/>
+          <w:sz w:val="24"/>
+        </w:rPr>
+        <w:t xml:space="preserve">: vimlesh1975). These applications are actively utilized not only by his parent organization but also by a massive global community of broadcast engineers and </w:t>
+      </w:r>
+      <w:proofErr w:type="spellStart"/>
+      <w:r>
+        <w:rPr>
+          <w:rFonts w:ascii="Calibri" w:hAnsi="Calibri" w:cs="Calibri"/>
+          <w:sz w:val="24"/>
+        </w:rPr>
+        <w:t>CasparCG</w:t>
+      </w:r>
+      <w:proofErr w:type="spellEnd"/>
+      <w:r>
+        <w:rPr>
+          <w:rFonts w:ascii="Calibri" w:hAnsi="Calibri" w:cs="Calibri"/>
+          <w:sz w:val="24"/>
+        </w:rPr>
+        <w:t xml:space="preserve"> users. His continuous support, updates, and community engagement demonstrate true leadership.</w:t>
+      </w:r>
+    </w:p>
+    <w:p>
+      <w:pPr>
+        <w:rPr>
+          <w:rFonts w:ascii="Calibri" w:hAnsi="Calibri" w:cs="Calibri"/>
+          <w:b/>
+          <w:sz w:val="28"/>
+        </w:rPr>
+      </w:pPr>
+      <w:r>
+        <w:rPr>
+          <w:rFonts w:ascii="Calibri" w:hAnsi="Calibri" w:cs="Calibri"/>
+          <w:b/>
+          <w:sz w:val="28"/>
+        </w:rPr>
+        <w:t xml:space="preserve">Community Impact and Global Support: The "Simple Video </w:t>
+      </w:r>
+      <w:proofErr w:type="spellStart"/>
+      <w:r>
+        <w:rPr>
+          <w:rFonts w:ascii="Calibri" w:hAnsi="Calibri" w:cs="Calibri"/>
+          <w:b/>
+          <w:sz w:val="28"/>
+        </w:rPr>
+        <w:t>Playout</w:t>
+      </w:r>
+      <w:proofErr w:type="spellEnd"/>
+      <w:r>
+        <w:rPr>
+          <w:rFonts w:ascii="Calibri" w:hAnsi="Calibri" w:cs="Calibri"/>
+          <w:b/>
+          <w:sz w:val="28"/>
+        </w:rPr>
+        <w:t>" Client</w:t>
+      </w:r>
+    </w:p>
+    <w:p>
+      <w:pPr>
+        <w:rPr>
+          <w:rFonts w:ascii="Calibri" w:hAnsi="Calibri" w:cs="Calibri"/>
+          <w:sz w:val="24"/>
+        </w:rPr>
+      </w:pPr>
+      <w:proofErr w:type="spellStart"/>
+      <w:r>
+        <w:rPr>
+          <w:rFonts w:ascii="Calibri" w:hAnsi="Calibri" w:cs="Calibri"/>
+          <w:sz w:val="24"/>
+        </w:rPr>
+        <w:t>Vimlesh</w:t>
+      </w:r>
+      <w:proofErr w:type="spellEnd"/>
+      <w:r>
+        <w:rPr>
+          <w:rFonts w:ascii="Calibri" w:hAnsi="Calibri" w:cs="Calibri"/>
+          <w:sz w:val="24"/>
+        </w:rPr>
+        <w:t xml:space="preserve"> Kumar’s contributions to the global broadcast engineering community are perfectly exemplified by his flagship open-source project, the "Simple Video </w:t>
+      </w:r>
+      <w:proofErr w:type="spellStart"/>
+      <w:r>
+        <w:rPr>
+          <w:rFonts w:ascii="Calibri" w:hAnsi="Calibri" w:cs="Calibri"/>
+          <w:sz w:val="24"/>
+        </w:rPr>
+        <w:t>Playout</w:t>
+      </w:r>
+      <w:proofErr w:type="spellEnd"/>
+      <w:r>
+        <w:rPr>
+          <w:rFonts w:ascii="Calibri" w:hAnsi="Calibri" w:cs="Calibri"/>
+          <w:sz w:val="24"/>
+        </w:rPr>
+        <w:t xml:space="preserve">" (also known as </w:t>
+      </w:r>
+      <w:proofErr w:type="spellStart"/>
+      <w:r>
+        <w:rPr>
+          <w:rFonts w:ascii="Calibri" w:hAnsi="Calibri" w:cs="Calibri"/>
+          <w:sz w:val="24"/>
+        </w:rPr>
+        <w:t>CasparMediaPlayback</w:t>
+      </w:r>
+      <w:proofErr w:type="spellEnd"/>
+      <w:r>
+        <w:rPr>
+          <w:rFonts w:ascii="Calibri" w:hAnsi="Calibri" w:cs="Calibri"/>
+          <w:sz w:val="24"/>
+        </w:rPr>
+        <w:t xml:space="preserve"> or CMP) client for </w:t>
+      </w:r>
+      <w:proofErr w:type="spellStart"/>
+      <w:r>
+        <w:rPr>
+          <w:rFonts w:ascii="Calibri" w:hAnsi="Calibri" w:cs="Calibri"/>
+          <w:sz w:val="24"/>
+        </w:rPr>
+        <w:t>CasparCG</w:t>
+      </w:r>
+      <w:proofErr w:type="spellEnd"/>
+      <w:r>
+        <w:rPr>
+          <w:rFonts w:ascii="Calibri" w:hAnsi="Calibri" w:cs="Calibri"/>
+          <w:sz w:val="24"/>
+        </w:rPr>
+        <w:t>.</w:t>
+      </w:r>
+    </w:p>
+    <w:p>
+      <w:pPr>
+        <w:rPr>
+          <w:rFonts w:ascii="Calibri" w:hAnsi="Calibri" w:cs="Calibri"/>
+          <w:b/>
+          <w:sz w:val="28"/>
+        </w:rPr>
+      </w:pPr>
+      <w:r>
+        <w:rPr>
+          <w:rFonts w:ascii="Calibri" w:hAnsi="Calibri" w:cs="Calibri"/>
+          <w:b/>
+          <w:sz w:val="28"/>
+        </w:rPr>
+        <w:lastRenderedPageBreak/>
+        <w:t>A Pillar of the Global Community</w:t>
+      </w:r>
+    </w:p>
+    <w:p>
+      <w:pPr>
+        <w:rPr>
+          <w:rFonts w:ascii="Calibri" w:hAnsi="Calibri" w:cs="Calibri"/>
+          <w:sz w:val="24"/>
+        </w:rPr>
+      </w:pPr>
+      <w:proofErr w:type="spellStart"/>
+      <w:r>
+        <w:rPr>
+          <w:rFonts w:ascii="Calibri" w:hAnsi="Calibri" w:cs="Calibri"/>
+          <w:sz w:val="24"/>
+        </w:rPr>
+        <w:t>Vimlesh's</w:t>
+      </w:r>
+      <w:proofErr w:type="spellEnd"/>
+      <w:r>
+        <w:rPr>
+          <w:rFonts w:ascii="Calibri" w:hAnsi="Calibri" w:cs="Calibri"/>
+          <w:sz w:val="24"/>
+        </w:rPr>
+        <w:t xml:space="preserve"> project thread on the official </w:t>
+      </w:r>
+      <w:proofErr w:type="spellStart"/>
+      <w:r>
+        <w:rPr>
+          <w:rFonts w:ascii="Calibri" w:hAnsi="Calibri" w:cs="Calibri"/>
+          <w:sz w:val="24"/>
+        </w:rPr>
+        <w:t>CasparCG</w:t>
+      </w:r>
+      <w:proofErr w:type="spellEnd"/>
+      <w:r>
+        <w:rPr>
+          <w:rFonts w:ascii="Calibri" w:hAnsi="Calibri" w:cs="Calibri"/>
+          <w:sz w:val="24"/>
+        </w:rPr>
+        <w:t xml:space="preserve"> Community Forum is widely recognized as one of the largest and longest-running discussions in the platform's history. By offering a robust, free, and incredibly versatile video </w:t>
+      </w:r>
+      <w:proofErr w:type="spellStart"/>
+      <w:r>
+        <w:rPr>
+          <w:rFonts w:ascii="Calibri" w:hAnsi="Calibri" w:cs="Calibri"/>
+          <w:sz w:val="24"/>
+        </w:rPr>
+        <w:t>playout</w:t>
+      </w:r>
+      <w:proofErr w:type="spellEnd"/>
+      <w:r>
+        <w:rPr>
+          <w:rFonts w:ascii="Calibri" w:hAnsi="Calibri" w:cs="Calibri"/>
+          <w:sz w:val="24"/>
+        </w:rPr>
+        <w:t xml:space="preserve"> solution, he has enabled countless individuals, local TV stations, and organizations around the world to achieve professional-grade broadcasting without the barrier of exorbitant software costs.</w:t>
+      </w:r>
+    </w:p>
+    <w:p>
+      <w:pPr>
+        <w:rPr>
+          <w:rFonts w:ascii="Calibri" w:hAnsi="Calibri" w:cs="Calibri"/>
+          <w:b/>
+          <w:sz w:val="28"/>
+        </w:rPr>
+      </w:pPr>
+      <w:r>
+        <w:rPr>
+          <w:rFonts w:ascii="Calibri" w:hAnsi="Calibri" w:cs="Calibri"/>
+          <w:b/>
+          <w:sz w:val="28"/>
+        </w:rPr>
+        <w:t>Continuous Innovation and Dedicated User Support</w:t>
+      </w:r>
+    </w:p>
+    <w:p>
+      <w:pPr>
+        <w:rPr>
+          <w:rFonts w:ascii="Calibri" w:hAnsi="Calibri" w:cs="Calibri"/>
+          <w:sz w:val="24"/>
+        </w:rPr>
+      </w:pPr>
+      <w:r>
+        <w:rPr>
+          <w:rFonts w:ascii="Calibri" w:hAnsi="Calibri" w:cs="Calibri"/>
+          <w:sz w:val="24"/>
+        </w:rPr>
+        <w:t xml:space="preserve">The forum thread stands as a testament to his giving nature and unwavering dedication. </w:t>
+      </w:r>
+      <w:proofErr w:type="spellStart"/>
+      <w:r>
+        <w:rPr>
+          <w:rFonts w:ascii="Calibri" w:hAnsi="Calibri" w:cs="Calibri"/>
+          <w:sz w:val="24"/>
+        </w:rPr>
+        <w:t>Vimlesh</w:t>
+      </w:r>
+      <w:proofErr w:type="spellEnd"/>
+      <w:r>
+        <w:rPr>
+          <w:rFonts w:ascii="Calibri" w:hAnsi="Calibri" w:cs="Calibri"/>
+          <w:sz w:val="24"/>
+        </w:rPr>
+        <w:t xml:space="preserve"> actively engages with users globally, providing real-time technical support, troubleshooting complex hardware configurations (such as </w:t>
+      </w:r>
+      <w:proofErr w:type="spellStart"/>
+      <w:r>
+        <w:rPr>
+          <w:rFonts w:ascii="Calibri" w:hAnsi="Calibri" w:cs="Calibri"/>
+          <w:sz w:val="24"/>
+        </w:rPr>
+        <w:t>Blackmagic</w:t>
+      </w:r>
+      <w:proofErr w:type="spellEnd"/>
+      <w:r>
+        <w:rPr>
+          <w:rFonts w:ascii="Calibri" w:hAnsi="Calibri" w:cs="Calibri"/>
+          <w:sz w:val="24"/>
+        </w:rPr>
+        <w:t xml:space="preserve"> DeckLink setups), and rapidly implementing new feature requests. As one grateful forum user noted, "You never cease to amaze! </w:t>
+      </w:r>
+      <w:proofErr w:type="gramStart"/>
+      <w:r>
+        <w:rPr>
+          <w:rFonts w:ascii="Calibri" w:hAnsi="Calibri" w:cs="Calibri"/>
+          <w:sz w:val="24"/>
+        </w:rPr>
+        <w:t>More power to you bro!"</w:t>
+      </w:r>
+      <w:proofErr w:type="gramEnd"/>
+    </w:p>
+    <w:p>
+      <w:pPr>
+        <w:rPr>
+          <w:rFonts w:ascii="Calibri" w:hAnsi="Calibri" w:cs="Calibri"/>
+          <w:sz w:val="24"/>
+        </w:rPr>
+      </w:pPr>
+      <w:r>
+        <w:rPr>
+          <w:rFonts w:ascii="Calibri" w:hAnsi="Calibri" w:cs="Calibri"/>
+          <w:sz w:val="24"/>
+        </w:rPr>
+        <w:t xml:space="preserve">Whether it is updating the client to support the latest web-based HTML templates, ensuring backward compatibility for legacy broadcast hardware, or even remotely assisting users through live screen-sharing sessions, </w:t>
+      </w:r>
+      <w:proofErr w:type="spellStart"/>
+      <w:r>
+        <w:rPr>
+          <w:rFonts w:ascii="Calibri" w:hAnsi="Calibri" w:cs="Calibri"/>
+          <w:sz w:val="24"/>
+        </w:rPr>
+        <w:t>Vimlesh's</w:t>
+      </w:r>
+      <w:proofErr w:type="spellEnd"/>
+      <w:r>
+        <w:rPr>
+          <w:rFonts w:ascii="Calibri" w:hAnsi="Calibri" w:cs="Calibri"/>
+          <w:sz w:val="24"/>
+        </w:rPr>
+        <w:t xml:space="preserve"> commitment goes far beyond typical open-source development. He has built a collaborative ecosystem where user feedback directly drives the continuous improvement of the software.</w:t>
       </w:r>
     </w:p>
     <w:p>
@@ -241,30 +701,55 @@
           <w:rFonts w:ascii="Calibri" w:hAnsi="Calibri" w:cs="Calibri"/>
           <w:sz w:val="24"/>
         </w:rPr>
-        <w:t>His repositories showcase a rare and diverse mastery of technologies, spanning HTML, JavaScript, React, Visual Basic .NET, and PowerShell, successfully bridging the gap between web development and low-level broadcast video processing.</w:t>
-      </w:r>
-    </w:p>
-    <w:p>
-      <w:pPr>
-        <w:rPr>
-          <w:rFonts w:ascii="Calibri" w:hAnsi="Calibri" w:cs="Calibri"/>
-          <w:sz w:val="24"/>
-        </w:rPr>
-      </w:pPr>
-    </w:p>
-    <w:p>
-      <w:pPr>
-        <w:rPr>
-          <w:rFonts w:ascii="Calibri" w:hAnsi="Calibri" w:cs="Calibri"/>
-          <w:sz w:val="24"/>
-        </w:rPr>
-      </w:pPr>
-      <w:r>
-        <w:rPr>
-          <w:rFonts w:ascii="Calibri" w:hAnsi="Calibri" w:cs="Calibri"/>
-          <w:sz w:val="24"/>
-        </w:rPr>
-        <w:t>Vimlesh Kumar embodies the spirit of the ABU Broadcast Engineering Excellence Award. Through his tireless dedication, technical ingenuity, and commitment to the open-source community, he has democratized high-end broadcast capabilities and established new standards for cost-effective media automation.</w:t>
+        <w:t xml:space="preserve">His repositories showcase a rare and diverse mastery of technologies, spanning HTML, JavaScript, React, Visual Basic .NET, and </w:t>
+      </w:r>
+      <w:proofErr w:type="spellStart"/>
+      <w:r>
+        <w:rPr>
+          <w:rFonts w:ascii="Calibri" w:hAnsi="Calibri" w:cs="Calibri"/>
+          <w:sz w:val="24"/>
+        </w:rPr>
+        <w:t>PowerShell</w:t>
+      </w:r>
+      <w:proofErr w:type="spellEnd"/>
+      <w:r>
+        <w:rPr>
+          <w:rFonts w:ascii="Calibri" w:hAnsi="Calibri" w:cs="Calibri"/>
+          <w:sz w:val="24"/>
+        </w:rPr>
+        <w:t>, successfully bridging the gap between web development and low-level broadcast video processing.</w:t>
+      </w:r>
+    </w:p>
+    <w:p>
+      <w:pPr>
+        <w:rPr>
+          <w:rFonts w:ascii="Calibri" w:hAnsi="Calibri" w:cs="Calibri"/>
+          <w:sz w:val="24"/>
+        </w:rPr>
+      </w:pPr>
+    </w:p>
+    <w:p>
+      <w:pPr>
+        <w:rPr>
+          <w:rFonts w:ascii="Calibri" w:hAnsi="Calibri" w:cs="Calibri"/>
+          <w:sz w:val="24"/>
+        </w:rPr>
+      </w:pPr>
+      <w:proofErr w:type="spellStart"/>
+      <w:r>
+        <w:rPr>
+          <w:rFonts w:ascii="Calibri" w:hAnsi="Calibri" w:cs="Calibri"/>
+          <w:sz w:val="24"/>
+        </w:rPr>
+        <w:t>Vimlesh</w:t>
+      </w:r>
+      <w:proofErr w:type="spellEnd"/>
+      <w:r>
+        <w:rPr>
+          <w:rFonts w:ascii="Calibri" w:hAnsi="Calibri" w:cs="Calibri"/>
+          <w:sz w:val="24"/>
+        </w:rPr>
+        <w:t xml:space="preserve"> Kumar embodies the spirit of the ABU Broadcast Engineering Excellence Award. Through his tireless dedication, technical ingenuity, and commitment to the open-source community, he has democratized high-end broadcast capabilities and established new standards for cost-effective media automation.</w:t>
       </w:r>
     </w:p>
     <w:sectPr>

</xml_diff>

<commit_message>
fix: update error message in print_outstanding.ps1 and modify nomination documentation files
</commit_message>
<xml_diff>
--- a/02_WHY YOU THINK YOUR NOMINEE SHOULD BE SELECTED.docx
+++ b/02_WHY YOU THINK YOUR NOMINEE SHOULD BE SELECTED.docx
@@ -701,17 +701,15 @@
           <w:rFonts w:ascii="Calibri" w:hAnsi="Calibri" w:cs="Calibri"/>
           <w:sz w:val="24"/>
         </w:rPr>
-        <w:t xml:space="preserve">His repositories showcase a rare and diverse mastery of technologies, spanning HTML, JavaScript, React, Visual Basic .NET, and </w:t>
-      </w:r>
-      <w:proofErr w:type="spellStart"/>
-      <w:r>
-        <w:rPr>
-          <w:rFonts w:ascii="Calibri" w:hAnsi="Calibri" w:cs="Calibri"/>
-          <w:sz w:val="24"/>
-        </w:rPr>
-        <w:t>PowerShell</w:t>
-      </w:r>
-      <w:proofErr w:type="spellEnd"/>
+        <w:t>His repositories showcase a rare and diverse mastery of technologies, spanning HTML, JavaScrip</w:t>
+      </w:r>
+      <w:r>
+        <w:rPr>
+          <w:rFonts w:ascii="Calibri" w:hAnsi="Calibri" w:cs="Calibri"/>
+          <w:sz w:val="24"/>
+        </w:rPr>
+        <w:t>t, React, Visual Basic .NET</w:t>
+      </w:r>
       <w:r>
         <w:rPr>
           <w:rFonts w:ascii="Calibri" w:hAnsi="Calibri" w:cs="Calibri"/>

</xml_diff>